<commit_message>
docs: test sayısını 51'e güncelle
Rapor ve sunum "32 API testi" diyordu; gerçek sayı 51 (api/src içinde
51 it/test bloğu). README.md, docs/TESLIMLER.md ve audit raporu zaten
51 diyordu, yani teslim paketi kendi içinde çelişiyordu.

Sayı generate_documents.py ve generate_slides.py içinde sabit yazılmış
olduğu için önce script'ler düzeltildi, sonra belgeler yeniden üretildi:

- Wayora-Proje-Raporu.docx: 3 yer (1.5 başarı kriterleri, 10. bölüm)
- Wayora-Proje-Yonetimi.docx: 1 yer (KPI tablosu)
- Wayora-Sunum.pptx: slayt 9 altbilgi, slayt 12 KPI, slayt 12 notu

User-Stories.docx test sayısı içermediği için dokunulmadı. Üretilen
dosyaların metni eski sürümlerle karşılaştırıldı; yalnızca bu satırlar
değişti.

Co-Authored-By: Claude Opus 5 <noreply@anthropic.com>
</commit_message>
<xml_diff>
--- a/docs/Wayora-Proje-Raporu.docx
+++ b/docs/Wayora-Proje-Raporu.docx
@@ -336,7 +336,7 @@
           <w:color w:val="1B1814"/>
           <w:sz w:val="20"/>
         </w:rPr>
-        <w:t>32 API testi ve 4 web testi ile kritik akışlar otomatik doğrulanır.</w:t>
+        <w:t>51 API testi ve 4 web testi ile kritik akışlar otomatik doğrulanır.</w:t>
       </w:r>
     </w:p>
     <w:p>
@@ -832,7 +832,7 @@
                 <w:color w:val="1B1814"/>
                 <w:sz w:val="17"/>
               </w:rPr>
-              <w:t>32 API + 4 web testi</w:t>
+              <w:t>51 API + 4 web testi</w:t>
             </w:r>
           </w:p>
         </w:tc>
@@ -7490,7 +7490,7 @@
           <w:color w:val="1B1814"/>
           <w:sz w:val="21"/>
         </w:rPr>
-        <w:t>Toplam 32 API ve 4 web testi bulunur. CI; lint, typecheck, test, build ve audit adımlarını her PR’da çalıştırır. Ayrıca gitleaks, CodeQL ve Semgrep iş akışları vardır.</w:t>
+        <w:t>Toplam 51 API ve 4 web testi bulunur. CI; lint, typecheck, test, build ve audit adımlarını her PR’da çalıştırır. Ayrıca gitleaks, CodeQL ve Semgrep iş akışları vardır.</w:t>
       </w:r>
     </w:p>
     <w:p>

</xml_diff>

<commit_message>
docs: test sayısını 51'e güncelle (#19)
Rapor ve sunum "32 API testi" diyordu; gerçek sayı 51 (api/src içinde
51 it/test bloğu). README.md, docs/TESLIMLER.md ve audit raporu zaten
51 diyordu, yani teslim paketi kendi içinde çelişiyordu.

Sayı generate_documents.py ve generate_slides.py içinde sabit yazılmış
olduğu için önce script'ler düzeltildi, sonra belgeler yeniden üretildi:

- Wayora-Proje-Raporu.docx: 3 yer (1.5 başarı kriterleri, 10. bölüm)
- Wayora-Proje-Yonetimi.docx: 1 yer (KPI tablosu)
- Wayora-Sunum.pptx: slayt 9 altbilgi, slayt 12 KPI, slayt 12 notu

User-Stories.docx test sayısı içermediği için dokunulmadı. Üretilen
dosyaların metni eski sürümlerle karşılaştırıldı; yalnızca bu satırlar
değişti.

Co-authored-by: Claude Opus 5 <noreply@anthropic.com>
</commit_message>
<xml_diff>
--- a/docs/Wayora-Proje-Raporu.docx
+++ b/docs/Wayora-Proje-Raporu.docx
@@ -336,7 +336,7 @@
           <w:color w:val="1B1814"/>
           <w:sz w:val="20"/>
         </w:rPr>
-        <w:t>32 API testi ve 4 web testi ile kritik akışlar otomatik doğrulanır.</w:t>
+        <w:t>51 API testi ve 4 web testi ile kritik akışlar otomatik doğrulanır.</w:t>
       </w:r>
     </w:p>
     <w:p>
@@ -832,7 +832,7 @@
                 <w:color w:val="1B1814"/>
                 <w:sz w:val="17"/>
               </w:rPr>
-              <w:t>32 API + 4 web testi</w:t>
+              <w:t>51 API + 4 web testi</w:t>
             </w:r>
           </w:p>
         </w:tc>
@@ -7490,7 +7490,7 @@
           <w:color w:val="1B1814"/>
           <w:sz w:val="21"/>
         </w:rPr>
-        <w:t>Toplam 32 API ve 4 web testi bulunur. CI; lint, typecheck, test, build ve audit adımlarını her PR’da çalıştırır. Ayrıca gitleaks, CodeQL ve Semgrep iş akışları vardır.</w:t>
+        <w:t>Toplam 51 API ve 4 web testi bulunur. CI; lint, typecheck, test, build ve audit adımlarını her PR’da çalıştırır. Ayrıca gitleaks, CodeQL ve Semgrep iş akışları vardır.</w:t>
       </w:r>
     </w:p>
     <w:p>

</xml_diff>

<commit_message>
docs: test sayısını 70 API + 6 web'e güncelle
Rapor ve sunum 51 API + 4 web diyordu; gece eklenen özelliklerle
(sosyal eşleştirme, 14 şehir/140 deneyim kataloğu, harita özellikleri)
gerçek sayı 70 API + 6 web'e çıktı.

Sayı generate_documents.py ve generate_slides.py içinde sabit
yazıldığı için önce script'ler düzeltildi, sonra belgeler bunlarla
yeniden üretildi:

- Wayora-Proje-Raporu.docx: 3 yer
- Wayora-Proje-Yonetimi.docx: 1 yer
- Wayora-Sunum.pptx: slayt 9 altbilgi, slayt 12 iki KPI sayısı, slayt
  12 konuşmacı notu

User-Stories.docx test sayısı içermediği için dokunulmadı. Üretilen
üç dosyanın metni HEAD'deki sürümlerle karşılaştırıldı; yalnızca bu
satırlar değişti.

Co-Authored-By: Claude Sonnet 5 <noreply@anthropic.com>
</commit_message>
<xml_diff>
--- a/docs/Wayora-Proje-Raporu.docx
+++ b/docs/Wayora-Proje-Raporu.docx
@@ -336,7 +336,7 @@
           <w:color w:val="1B1814"/>
           <w:sz w:val="20"/>
         </w:rPr>
-        <w:t>51 API testi ve 4 web testi ile kritik akışlar otomatik doğrulanır.</w:t>
+        <w:t>70 API testi ve 6 web testi ile kritik akışlar otomatik doğrulanır.</w:t>
       </w:r>
     </w:p>
     <w:p>
@@ -832,7 +832,7 @@
                 <w:color w:val="1B1814"/>
                 <w:sz w:val="17"/>
               </w:rPr>
-              <w:t>51 API + 4 web testi</w:t>
+              <w:t>70 API + 6 web testi</w:t>
             </w:r>
           </w:p>
         </w:tc>
@@ -7490,7 +7490,7 @@
           <w:color w:val="1B1814"/>
           <w:sz w:val="21"/>
         </w:rPr>
-        <w:t>Toplam 51 API ve 4 web testi bulunur. CI; lint, typecheck, test, build ve audit adımlarını her PR’da çalıştırır. Ayrıca gitleaks, CodeQL ve Semgrep iş akışları vardır.</w:t>
+        <w:t>Toplam 70 API ve 6 web testi bulunur. CI; lint, typecheck, test, build ve audit adımlarını her PR’da çalıştırır. Ayrıca gitleaks, CodeQL ve Semgrep iş akışları vardır.</w:t>
       </w:r>
     </w:p>
     <w:p>

</xml_diff>

<commit_message>
docs: test sayısını 70 API + 6 web'e güncelle (#45)
Rapor ve sunum 51 API + 4 web diyordu; gece eklenen özelliklerle
(sosyal eşleştirme, 14 şehir/140 deneyim kataloğu, harita özellikleri)
gerçek sayı 70 API + 6 web'e çıktı.

Sayı generate_documents.py ve generate_slides.py içinde sabit
yazıldığı için önce script'ler düzeltildi, sonra belgeler bunlarla
yeniden üretildi:

- Wayora-Proje-Raporu.docx: 3 yer
- Wayora-Proje-Yonetimi.docx: 1 yer
- Wayora-Sunum.pptx: slayt 9 altbilgi, slayt 12 iki KPI sayısı, slayt
  12 konuşmacı notu

User-Stories.docx test sayısı içermediği için dokunulmadı. Üretilen
üç dosyanın metni HEAD'deki sürümlerle karşılaştırıldı; yalnızca bu
satırlar değişti.

Co-authored-by: Claude Sonnet 5 <noreply@anthropic.com>
</commit_message>
<xml_diff>
--- a/docs/Wayora-Proje-Raporu.docx
+++ b/docs/Wayora-Proje-Raporu.docx
@@ -336,7 +336,7 @@
           <w:color w:val="1B1814"/>
           <w:sz w:val="20"/>
         </w:rPr>
-        <w:t>51 API testi ve 4 web testi ile kritik akışlar otomatik doğrulanır.</w:t>
+        <w:t>70 API testi ve 6 web testi ile kritik akışlar otomatik doğrulanır.</w:t>
       </w:r>
     </w:p>
     <w:p>
@@ -832,7 +832,7 @@
                 <w:color w:val="1B1814"/>
                 <w:sz w:val="17"/>
               </w:rPr>
-              <w:t>51 API + 4 web testi</w:t>
+              <w:t>70 API + 6 web testi</w:t>
             </w:r>
           </w:p>
         </w:tc>
@@ -7490,7 +7490,7 @@
           <w:color w:val="1B1814"/>
           <w:sz w:val="21"/>
         </w:rPr>
-        <w:t>Toplam 51 API ve 4 web testi bulunur. CI; lint, typecheck, test, build ve audit adımlarını her PR’da çalıştırır. Ayrıca gitleaks, CodeQL ve Semgrep iş akışları vardır.</w:t>
+        <w:t>Toplam 70 API ve 6 web testi bulunur. CI; lint, typecheck, test, build ve audit adımlarını her PR’da çalıştırır. Ayrıca gitleaks, CodeQL ve Semgrep iş akışları vardır.</w:t>
       </w:r>
     </w:p>
     <w:p>

</xml_diff>